<commit_message>
Correct citations after verification against source PDFs
Verified six peer-reviewed sources against the original publications and
fixed errors found:
- NordiCHI '06 paper was misattributed to 'de Sá & Carriço' -> correct
  authors are Lim, Pangam, Periyasami & Aneja (2006), pp. 291-300
- Guerreiro et al. (2023, TACL) author list corrected (removed erroneous
  'Voita'; added Alves, Waldendorf, Haddow, Birch, Colombo)
- Classical Quarterly (2024) article given correct author and locator:
  Parker, D., 74(1), 124-134
- Updated in-text citations and limitations note accordingly

https://claude.ai/code/session_011EEXvpWJaEGXMadBDpkP79
</commit_message>
<xml_diff>
--- a/lorem-ipsum-narrative-review.docx
+++ b/lorem-ipsum-narrative-review.docx
@@ -617,7 +617,7 @@
         <w:t xml:space="preserve">Epicurean and is voiced by Torquatus</w:t>
       </w:r>
       <w:r>
-        <w:t xml:space="preserve">; a claim occasionally encountered that the passage belongs to "Hieronymus" is unsupported—Hieronymus of Rhodes figures elsewhere in Cicero's doxographic survey of ethical positions but is not the speaker here (Annas &amp; Betegh, 2016; "The Inconsistency Charge," 2024). Second, the passage is not incidental filler in Cicero's argument but a node in his central exposition of the Epicurean calculus of pleasure and pain—an irony noted by classicist commentators: the world's standard </w:t>
+        <w:t xml:space="preserve">; a claim occasionally encountered that the passage belongs to "Hieronymus" is unsupported—Hieronymus of Rhodes figures elsewhere in Cicero's doxographic survey of ethical positions but is not the speaker here (Annas &amp; Betegh, 2016; Parker, 2024). Second, the passage is not incidental filler in Cicero's argument but a node in his central exposition of the Epicurean calculus of pleasure and pain—an irony noted by classicist commentators: the world's standard </w:t>
       </w:r>
       <w:r>
         <w:rPr>
@@ -1783,7 +1783,7 @@
         <w:t xml:space="preserve">no significant difference</w:t>
       </w:r>
       <w:r>
-        <w:t xml:space="preserve"> in the number or severity of usability problems surfaced across low-, medium-, and high-fidelity prototypes, and comparable fidelity comparisons in mobile and tabletop settings have returned mixed results (de Sá &amp; Carriço, 2006). The honest synthesis is that </w:t>
+        <w:t xml:space="preserve"> in the number or severity of usability problems surfaced across low-, medium-, and high-fidelity prototypes, and comparable fidelity comparisons in mobile settings have returned mixed results (Lim et al., 2006). The honest synthesis is that </w:t>
       </w:r>
       <w:r>
         <w:rPr>
@@ -2135,7 +2135,7 @@
         <w:t xml:space="preserve">Before &amp; After</w:t>
       </w:r>
       <w:r>
-        <w:t xml:space="preserve"> letter, of the Letraset specimen record (Shaughnessy &amp; Brook, 2015), and of the disputed personal attributions would materially strengthen the historical account. Source retrieval was also subject to indexing constraints, and primary full texts behind several citations were consulted via bibliographic and edition metadata rather than page images; quoted wording from the Latin and its translation should be checked against the cited critical editions (Cicero, 1914, 1998; Perseus Digital Library, n.d.) before reproduction.</w:t>
+        <w:t xml:space="preserve"> letter, of the Letraset specimen record (Shaughnessy &amp; Brook, 2015), and of the disputed personal attributions would materially strengthen the historical account. The peer-reviewed sources central to the empirical and philological arguments (Grothoff et al., 2005; Lim et al., 2006; Sauer &amp; Sonderegger, 2009; Sonderegger &amp; Sauer, 2010; Guerreiro et al., 2023; Parker, 2024) were verified against the original publications; the remaining citations—including the primary critical editions and the design-historical and journalistic sources—rest on publisher and edition metadata rather than full-text inspection, and quoted wording from the Latin and its translation should be checked against the cited critical editions (Cicero, 1914, 1998; Perseus Digital Library, n.d.) before reproduction.</w:t>
       </w:r>
     </w:p>
     <w:p>
@@ -2414,23 +2414,23 @@
           <w:sz w:val="20"/>
           <w:szCs w:val="20"/>
         </w:rPr>
-        <w:t xml:space="preserve">de Sá, M., &amp; Carriço, L. (2006). Low- vs. high-fidelity prototypes and the validity of mobile usability evaluations. In </w:t>
-      </w:r>
-      <w:r>
-        <w:rPr>
-          <w:i/>
-          <w:iCs/>
-          <w:sz w:val="20"/>
-          <w:szCs w:val="20"/>
-        </w:rPr>
-        <w:t xml:space="preserve">Proceedings of the 4th Nordic Conference on Human–Computer Interaction (NordiCHI '06)</w:t>
-      </w:r>
-      <w:r>
-        <w:rPr>
-          <w:sz w:val="20"/>
-          <w:szCs w:val="20"/>
-        </w:rPr>
-        <w:t xml:space="preserve">. Association for Computing Machinery. https://doi.org/10.1145/1182475.1182506</w:t>
+        <w:t xml:space="preserve">Deque Systems. (n.d.). </w:t>
+      </w:r>
+      <w:r>
+        <w:rPr>
+          <w:i/>
+          <w:iCs/>
+          <w:sz w:val="20"/>
+          <w:szCs w:val="20"/>
+        </w:rPr>
+        <w:t xml:space="preserve">Accessible forms: The problem with placeholders</w:t>
+      </w:r>
+      <w:r>
+        <w:rPr>
+          <w:sz w:val="20"/>
+          <w:szCs w:val="20"/>
+        </w:rPr>
+        <w:t xml:space="preserve">. https://www.deque.com/blog/accessible-forms-the-problem-with-placeholders/</w:t>
       </w:r>
     </w:p>
     <w:p>
@@ -2443,23 +2443,23 @@
           <w:sz w:val="20"/>
           <w:szCs w:val="20"/>
         </w:rPr>
-        <w:t xml:space="preserve">Deque Systems. (n.d.). </w:t>
-      </w:r>
-      <w:r>
-        <w:rPr>
-          <w:i/>
-          <w:iCs/>
-          <w:sz w:val="20"/>
-          <w:szCs w:val="20"/>
-        </w:rPr>
-        <w:t xml:space="preserve">Accessible forms: The problem with placeholders</w:t>
-      </w:r>
-      <w:r>
-        <w:rPr>
-          <w:sz w:val="20"/>
-          <w:szCs w:val="20"/>
-        </w:rPr>
-        <w:t xml:space="preserve">. https://www.deque.com/blog/accessible-forms-the-problem-with-placeholders/</w:t>
+        <w:t xml:space="preserve">Greenhalgh, T., Thorne, S., &amp; Malterud, K. (2018). Time to challenge the spurious hierarchy of systematic over narrative reviews? </w:t>
+      </w:r>
+      <w:r>
+        <w:rPr>
+          <w:i/>
+          <w:iCs/>
+          <w:sz w:val="20"/>
+          <w:szCs w:val="20"/>
+        </w:rPr>
+        <w:t xml:space="preserve">European Journal of Clinical Investigation, 48</w:t>
+      </w:r>
+      <w:r>
+        <w:rPr>
+          <w:sz w:val="20"/>
+          <w:szCs w:val="20"/>
+        </w:rPr>
+        <w:t xml:space="preserve">(6), e12931. https://doi.org/10.1111/eci.12931</w:t>
       </w:r>
     </w:p>
     <w:p>
@@ -2472,23 +2472,23 @@
           <w:sz w:val="20"/>
           <w:szCs w:val="20"/>
         </w:rPr>
-        <w:t xml:space="preserve">Greenhalgh, T., Thorne, S., &amp; Malterud, K. (2018). Time to challenge the spurious hierarchy of systematic over narrative reviews? </w:t>
-      </w:r>
-      <w:r>
-        <w:rPr>
-          <w:i/>
-          <w:iCs/>
-          <w:sz w:val="20"/>
-          <w:szCs w:val="20"/>
-        </w:rPr>
-        <w:t xml:space="preserve">European Journal of Clinical Investigation, 48</w:t>
-      </w:r>
-      <w:r>
-        <w:rPr>
-          <w:sz w:val="20"/>
-          <w:szCs w:val="20"/>
-        </w:rPr>
-        <w:t xml:space="preserve">(6), e12931. https://doi.org/10.1111/eci.12931</w:t>
+        <w:t xml:space="preserve">Grothoff, C., Grothoff, K., Alkhutova, L., Stutsman, R., &amp; Atallah, M. (2005). Translation-based steganography. In </w:t>
+      </w:r>
+      <w:r>
+        <w:rPr>
+          <w:i/>
+          <w:iCs/>
+          <w:sz w:val="20"/>
+          <w:szCs w:val="20"/>
+        </w:rPr>
+        <w:t xml:space="preserve">Information Hiding (IH 2005)</w:t>
+      </w:r>
+      <w:r>
+        <w:rPr>
+          <w:sz w:val="20"/>
+          <w:szCs w:val="20"/>
+        </w:rPr>
+        <w:t xml:space="preserve"> (Lecture Notes in Computer Science Vol. 4437, pp. 213–233). Springer. https://doi.org/10.1007/11558859_17</w:t>
       </w:r>
     </w:p>
     <w:p>
@@ -2501,23 +2501,23 @@
           <w:sz w:val="20"/>
           <w:szCs w:val="20"/>
         </w:rPr>
-        <w:t xml:space="preserve">Grothoff, C., Grothoff, K., Alkhutova, L., Stutsman, R., &amp; Atallah, M. (2005). Translation-based steganography. In </w:t>
-      </w:r>
-      <w:r>
-        <w:rPr>
-          <w:i/>
-          <w:iCs/>
-          <w:sz w:val="20"/>
-          <w:szCs w:val="20"/>
-        </w:rPr>
-        <w:t xml:space="preserve">Information Hiding (IH 2005)</w:t>
-      </w:r>
-      <w:r>
-        <w:rPr>
-          <w:sz w:val="20"/>
-          <w:szCs w:val="20"/>
-        </w:rPr>
-        <w:t xml:space="preserve"> (Lecture Notes in Computer Science Vol. 4437, pp. 213–233). Springer. https://doi.org/10.1007/11558859_17</w:t>
+        <w:t xml:space="preserve">Guerreiro, N. M., Alves, D. M., Waldendorf, J., Haddow, B., Birch, A., Colombo, P., &amp; Martins, A. F. T. (2023). Hallucinations in large multilingual translation models. </w:t>
+      </w:r>
+      <w:r>
+        <w:rPr>
+          <w:i/>
+          <w:iCs/>
+          <w:sz w:val="20"/>
+          <w:szCs w:val="20"/>
+        </w:rPr>
+        <w:t xml:space="preserve">Transactions of the Association for Computational Linguistics, 11</w:t>
+      </w:r>
+      <w:r>
+        <w:rPr>
+          <w:sz w:val="20"/>
+          <w:szCs w:val="20"/>
+        </w:rPr>
+        <w:t xml:space="preserve">, 1500–1517. https://doi.org/10.1162/tacl_a_00615</w:t>
       </w:r>
     </w:p>
     <w:p>
@@ -2530,23 +2530,23 @@
           <w:sz w:val="20"/>
           <w:szCs w:val="20"/>
         </w:rPr>
-        <w:t xml:space="preserve">Guerreiro, N. M., Voita, E., &amp; Martins, A. F. T. (2023). Hallucinations in large multilingual translation models. </w:t>
-      </w:r>
-      <w:r>
-        <w:rPr>
-          <w:i/>
-          <w:iCs/>
-          <w:sz w:val="20"/>
-          <w:szCs w:val="20"/>
-        </w:rPr>
-        <w:t xml:space="preserve">Transactions of the Association for Computational Linguistics, 11</w:t>
-      </w:r>
-      <w:r>
-        <w:rPr>
-          <w:sz w:val="20"/>
-          <w:szCs w:val="20"/>
-        </w:rPr>
-        <w:t xml:space="preserve">, 1500–1517. https://doi.org/10.1162/tacl_a_00615</w:t>
+        <w:t xml:space="preserve">Heller, S. (2018, February 15). </w:t>
+      </w:r>
+      <w:r>
+        <w:rPr>
+          <w:i/>
+          <w:iCs/>
+          <w:sz w:val="20"/>
+          <w:szCs w:val="20"/>
+        </w:rPr>
+        <w:t xml:space="preserve">When type was dry</w:t>
+      </w:r>
+      <w:r>
+        <w:rPr>
+          <w:sz w:val="20"/>
+          <w:szCs w:val="20"/>
+        </w:rPr>
+        <w:t xml:space="preserve">. PRINT Magazine. https://www.printmag.com/daily-heller/when-type-was-dry-letraset/</w:t>
       </w:r>
     </w:p>
     <w:p>
@@ -2559,23 +2559,23 @@
           <w:sz w:val="20"/>
           <w:szCs w:val="20"/>
         </w:rPr>
-        <w:t xml:space="preserve">Heller, S. (2018, February 15). </w:t>
-      </w:r>
-      <w:r>
-        <w:rPr>
-          <w:i/>
-          <w:iCs/>
-          <w:sz w:val="20"/>
-          <w:szCs w:val="20"/>
-        </w:rPr>
-        <w:t xml:space="preserve">When type was dry</w:t>
-      </w:r>
-      <w:r>
-        <w:rPr>
-          <w:sz w:val="20"/>
-          <w:szCs w:val="20"/>
-        </w:rPr>
-        <w:t xml:space="preserve">. PRINT Magazine. https://www.printmag.com/daily-heller/when-type-was-dry-letraset/</w:t>
+        <w:t xml:space="preserve">Krebs, B. (2014, August 27). </w:t>
+      </w:r>
+      <w:r>
+        <w:rPr>
+          <w:i/>
+          <w:iCs/>
+          <w:sz w:val="20"/>
+          <w:szCs w:val="20"/>
+        </w:rPr>
+        <w:t xml:space="preserve">Lorem ipsum: Of good &amp; evil, Google &amp; China</w:t>
+      </w:r>
+      <w:r>
+        <w:rPr>
+          <w:sz w:val="20"/>
+          <w:szCs w:val="20"/>
+        </w:rPr>
+        <w:t xml:space="preserve">. Krebs on Security. https://krebsonsecurity.com/2014/08/lorem-ipsum-of-good-evil-google-china/</w:t>
       </w:r>
     </w:p>
     <w:p>
@@ -2588,39 +2588,23 @@
           <w:sz w:val="20"/>
           <w:szCs w:val="20"/>
         </w:rPr>
-        <w:t xml:space="preserve">The inconsistency charge in Cicero's </w:t>
-      </w:r>
-      <w:r>
-        <w:rPr>
-          <w:i/>
-          <w:iCs/>
-          <w:sz w:val="20"/>
-          <w:szCs w:val="20"/>
-        </w:rPr>
-        <w:t xml:space="preserve">De finibus</w:t>
-      </w:r>
-      <w:r>
-        <w:rPr>
-          <w:sz w:val="20"/>
-          <w:szCs w:val="20"/>
-        </w:rPr>
-        <w:t xml:space="preserve"> 1–2. (2024). </w:t>
-      </w:r>
-      <w:r>
-        <w:rPr>
-          <w:i/>
-          <w:iCs/>
-          <w:sz w:val="20"/>
-          <w:szCs w:val="20"/>
-        </w:rPr>
-        <w:t xml:space="preserve">The Classical Quarterly</w:t>
-      </w:r>
-      <w:r>
-        <w:rPr>
-          <w:sz w:val="20"/>
-          <w:szCs w:val="20"/>
-        </w:rPr>
-        <w:t xml:space="preserve">. Cambridge University Press. https://doi.org/10.1017/S0009838824000107</w:t>
+        <w:t xml:space="preserve">Lamacraft, J. (2013). Rub-down revolution. </w:t>
+      </w:r>
+      <w:r>
+        <w:rPr>
+          <w:i/>
+          <w:iCs/>
+          <w:sz w:val="20"/>
+          <w:szCs w:val="20"/>
+        </w:rPr>
+        <w:t xml:space="preserve">Eye Magazine, (86)</w:t>
+      </w:r>
+      <w:r>
+        <w:rPr>
+          <w:sz w:val="20"/>
+          <w:szCs w:val="20"/>
+        </w:rPr>
+        <w:t xml:space="preserve">. https://www.eyemagazine.com/feature/article/rub-down-revolution</w:t>
       </w:r>
     </w:p>
     <w:p>
@@ -2633,23 +2617,23 @@
           <w:sz w:val="20"/>
           <w:szCs w:val="20"/>
         </w:rPr>
-        <w:t xml:space="preserve">Krebs, B. (2014, August 27). </w:t>
-      </w:r>
-      <w:r>
-        <w:rPr>
-          <w:i/>
-          <w:iCs/>
-          <w:sz w:val="20"/>
-          <w:szCs w:val="20"/>
-        </w:rPr>
-        <w:t xml:space="preserve">Lorem ipsum: Of good &amp; evil, Google &amp; China</w:t>
-      </w:r>
-      <w:r>
-        <w:rPr>
-          <w:sz w:val="20"/>
-          <w:szCs w:val="20"/>
-        </w:rPr>
-        <w:t xml:space="preserve">. Krebs on Security. https://krebsonsecurity.com/2014/08/lorem-ipsum-of-good-evil-google-china/</w:t>
+        <w:t xml:space="preserve">Liberman, M. (2014, August 20). </w:t>
+      </w:r>
+      <w:r>
+        <w:rPr>
+          <w:i/>
+          <w:iCs/>
+          <w:sz w:val="20"/>
+          <w:szCs w:val="20"/>
+        </w:rPr>
+        <w:t xml:space="preserve">Lorem China</w:t>
+      </w:r>
+      <w:r>
+        <w:rPr>
+          <w:sz w:val="20"/>
+          <w:szCs w:val="20"/>
+        </w:rPr>
+        <w:t xml:space="preserve">. Language Log, University of Pennsylvania. https://languagelog.ldc.upenn.edu/nll/?p=14163</w:t>
       </w:r>
     </w:p>
     <w:p>
@@ -2662,23 +2646,23 @@
           <w:sz w:val="20"/>
           <w:szCs w:val="20"/>
         </w:rPr>
-        <w:t xml:space="preserve">Lamacraft, J. (2013). Rub-down revolution. </w:t>
-      </w:r>
-      <w:r>
-        <w:rPr>
-          <w:i/>
-          <w:iCs/>
-          <w:sz w:val="20"/>
-          <w:szCs w:val="20"/>
-        </w:rPr>
-        <w:t xml:space="preserve">Eye Magazine, (86)</w:t>
-      </w:r>
-      <w:r>
-        <w:rPr>
-          <w:sz w:val="20"/>
-          <w:szCs w:val="20"/>
-        </w:rPr>
-        <w:t xml:space="preserve">. https://www.eyemagazine.com/feature/article/rub-down-revolution</w:t>
+        <w:t xml:space="preserve">Lim, Y., Pangam, A., Periyasami, S., &amp; Aneja, S. (2006). Comparative analysis of high- and low-fidelity prototypes for more valid usability evaluations of mobile devices. In </w:t>
+      </w:r>
+      <w:r>
+        <w:rPr>
+          <w:i/>
+          <w:iCs/>
+          <w:sz w:val="20"/>
+          <w:szCs w:val="20"/>
+        </w:rPr>
+        <w:t xml:space="preserve">Proceedings of the 4th Nordic Conference on Human–Computer Interaction (NordiCHI '06)</w:t>
+      </w:r>
+      <w:r>
+        <w:rPr>
+          <w:sz w:val="20"/>
+          <w:szCs w:val="20"/>
+        </w:rPr>
+        <w:t xml:space="preserve"> (pp. 291–300). Association for Computing Machinery. https://doi.org/10.1145/1182475.1182506</w:t>
       </w:r>
     </w:p>
     <w:p>
@@ -2691,23 +2675,23 @@
           <w:sz w:val="20"/>
           <w:szCs w:val="20"/>
         </w:rPr>
-        <w:t xml:space="preserve">Liberman, M. (2014, August 20). </w:t>
-      </w:r>
-      <w:r>
-        <w:rPr>
-          <w:i/>
-          <w:iCs/>
-          <w:sz w:val="20"/>
-          <w:szCs w:val="20"/>
-        </w:rPr>
-        <w:t xml:space="preserve">Lorem China</w:t>
-      </w:r>
-      <w:r>
-        <w:rPr>
-          <w:sz w:val="20"/>
-          <w:szCs w:val="20"/>
-        </w:rPr>
-        <w:t xml:space="preserve">. Language Log, University of Pennsylvania. https://languagelog.ldc.upenn.edu/nll/?p=14163</w:t>
+        <w:t xml:space="preserve">Lipsum.com. (n.d.). </w:t>
+      </w:r>
+      <w:r>
+        <w:rPr>
+          <w:i/>
+          <w:iCs/>
+          <w:sz w:val="20"/>
+          <w:szCs w:val="20"/>
+        </w:rPr>
+        <w:t xml:space="preserve">Lorem Ipsum: All the facts</w:t>
+      </w:r>
+      <w:r>
+        <w:rPr>
+          <w:sz w:val="20"/>
+          <w:szCs w:val="20"/>
+        </w:rPr>
+        <w:t xml:space="preserve">. https://www.lipsum.com/</w:t>
       </w:r>
     </w:p>
     <w:p>
@@ -2720,23 +2704,39 @@
           <w:sz w:val="20"/>
           <w:szCs w:val="20"/>
         </w:rPr>
-        <w:t xml:space="preserve">Lipsum.com. (n.d.). </w:t>
-      </w:r>
-      <w:r>
-        <w:rPr>
-          <w:i/>
-          <w:iCs/>
-          <w:sz w:val="20"/>
-          <w:szCs w:val="20"/>
-        </w:rPr>
-        <w:t xml:space="preserve">Lorem Ipsum: All the facts</w:t>
-      </w:r>
-      <w:r>
-        <w:rPr>
-          <w:sz w:val="20"/>
-          <w:szCs w:val="20"/>
-        </w:rPr>
-        <w:t xml:space="preserve">. https://www.lipsum.com/</w:t>
+        <w:t xml:space="preserve">McClintock, R. (1994). [Letter identifying the Ciceronian source of </w:t>
+      </w:r>
+      <w:r>
+        <w:rPr>
+          <w:i/>
+          <w:iCs/>
+          <w:sz w:val="20"/>
+          <w:szCs w:val="20"/>
+        </w:rPr>
+        <w:t xml:space="preserve">lorem ipsum</w:t>
+      </w:r>
+      <w:r>
+        <w:rPr>
+          <w:sz w:val="20"/>
+          <w:szCs w:val="20"/>
+        </w:rPr>
+        <w:t xml:space="preserve">]. </w:t>
+      </w:r>
+      <w:r>
+        <w:rPr>
+          <w:i/>
+          <w:iCs/>
+          <w:sz w:val="20"/>
+          <w:szCs w:val="20"/>
+        </w:rPr>
+        <w:t xml:space="preserve">Before &amp; After, 4</w:t>
+      </w:r>
+      <w:r>
+        <w:rPr>
+          <w:sz w:val="20"/>
+          <w:szCs w:val="20"/>
+        </w:rPr>
+        <w:t xml:space="preserve">(2).</w:t>
       </w:r>
     </w:p>
     <w:p>
@@ -2749,39 +2749,23 @@
           <w:sz w:val="20"/>
           <w:szCs w:val="20"/>
         </w:rPr>
-        <w:t xml:space="preserve">McClintock, R. (1994). [Letter identifying the Ciceronian source of </w:t>
-      </w:r>
-      <w:r>
-        <w:rPr>
-          <w:i/>
-          <w:iCs/>
-          <w:sz w:val="20"/>
-          <w:szCs w:val="20"/>
-        </w:rPr>
-        <w:t xml:space="preserve">lorem ipsum</w:t>
-      </w:r>
-      <w:r>
-        <w:rPr>
-          <w:sz w:val="20"/>
-          <w:szCs w:val="20"/>
-        </w:rPr>
-        <w:t xml:space="preserve">]. </w:t>
-      </w:r>
-      <w:r>
-        <w:rPr>
-          <w:i/>
-          <w:iCs/>
-          <w:sz w:val="20"/>
-          <w:szCs w:val="20"/>
-        </w:rPr>
-        <w:t xml:space="preserve">Before &amp; After, 4</w:t>
-      </w:r>
-      <w:r>
-        <w:rPr>
-          <w:sz w:val="20"/>
-          <w:szCs w:val="20"/>
-        </w:rPr>
-        <w:t xml:space="preserve">(2).</w:t>
+        <w:t xml:space="preserve">McGrane, K. (2010, January 10). </w:t>
+      </w:r>
+      <w:r>
+        <w:rPr>
+          <w:i/>
+          <w:iCs/>
+          <w:sz w:val="20"/>
+          <w:szCs w:val="20"/>
+        </w:rPr>
+        <w:t xml:space="preserve">In defense of lorem ipsum</w:t>
+      </w:r>
+      <w:r>
+        <w:rPr>
+          <w:sz w:val="20"/>
+          <w:szCs w:val="20"/>
+        </w:rPr>
+        <w:t xml:space="preserve">. User Interface Engineering. https://articles.uie.com/lorem_ipsum_defense/</w:t>
       </w:r>
     </w:p>
     <w:p>
@@ -2794,23 +2778,23 @@
           <w:sz w:val="20"/>
           <w:szCs w:val="20"/>
         </w:rPr>
-        <w:t xml:space="preserve">McGrane, K. (2010, January 10). </w:t>
-      </w:r>
-      <w:r>
-        <w:rPr>
-          <w:i/>
-          <w:iCs/>
-          <w:sz w:val="20"/>
-          <w:szCs w:val="20"/>
-        </w:rPr>
-        <w:t xml:space="preserve">In defense of lorem ipsum</w:t>
-      </w:r>
-      <w:r>
-        <w:rPr>
-          <w:sz w:val="20"/>
-          <w:szCs w:val="20"/>
-        </w:rPr>
-        <w:t xml:space="preserve">. User Interface Engineering. https://articles.uie.com/lorem_ipsum_defense/</w:t>
+        <w:t xml:space="preserve">Nielsen Norman Group. (2014). </w:t>
+      </w:r>
+      <w:r>
+        <w:rPr>
+          <w:i/>
+          <w:iCs/>
+          <w:sz w:val="20"/>
+          <w:szCs w:val="20"/>
+        </w:rPr>
+        <w:t xml:space="preserve">Placeholders in form fields are harmful</w:t>
+      </w:r>
+      <w:r>
+        <w:rPr>
+          <w:sz w:val="20"/>
+          <w:szCs w:val="20"/>
+        </w:rPr>
+        <w:t xml:space="preserve">. https://www.nngroup.com/articles/form-design-placeholders/</w:t>
       </w:r>
     </w:p>
     <w:p>
@@ -2823,23 +2807,23 @@
           <w:sz w:val="20"/>
           <w:szCs w:val="20"/>
         </w:rPr>
-        <w:t xml:space="preserve">Nielsen Norman Group. (2014). </w:t>
-      </w:r>
-      <w:r>
-        <w:rPr>
-          <w:i/>
-          <w:iCs/>
-          <w:sz w:val="20"/>
-          <w:szCs w:val="20"/>
-        </w:rPr>
-        <w:t xml:space="preserve">Placeholders in form fields are harmful</w:t>
-      </w:r>
-      <w:r>
-        <w:rPr>
-          <w:sz w:val="20"/>
-          <w:szCs w:val="20"/>
-        </w:rPr>
-        <w:t xml:space="preserve">. https://www.nngroup.com/articles/form-design-placeholders/</w:t>
+        <w:t xml:space="preserve">O'Donnell, J. J. (n.d.). </w:t>
+      </w:r>
+      <w:r>
+        <w:rPr>
+          <w:i/>
+          <w:iCs/>
+          <w:sz w:val="20"/>
+          <w:szCs w:val="20"/>
+        </w:rPr>
+        <w:t xml:space="preserve">Fake Latin</w:t>
+      </w:r>
+      <w:r>
+        <w:rPr>
+          <w:sz w:val="20"/>
+          <w:szCs w:val="20"/>
+        </w:rPr>
+        <w:t xml:space="preserve">. Georgetown University. https://faculty.georgetown.edu/jod/texts/fakelatin.html</w:t>
       </w:r>
     </w:p>
     <w:p>
@@ -2852,23 +2836,39 @@
           <w:sz w:val="20"/>
           <w:szCs w:val="20"/>
         </w:rPr>
-        <w:t xml:space="preserve">O'Donnell, J. J. (n.d.). </w:t>
-      </w:r>
-      <w:r>
-        <w:rPr>
-          <w:i/>
-          <w:iCs/>
-          <w:sz w:val="20"/>
-          <w:szCs w:val="20"/>
-        </w:rPr>
-        <w:t xml:space="preserve">Fake Latin</w:t>
-      </w:r>
-      <w:r>
-        <w:rPr>
-          <w:sz w:val="20"/>
-          <w:szCs w:val="20"/>
-        </w:rPr>
-        <w:t xml:space="preserve">. Georgetown University. https://faculty.georgetown.edu/jod/texts/fakelatin.html</w:t>
+        <w:t xml:space="preserve">Parker, D. (2024). The inconsistency charge in Cicero's </w:t>
+      </w:r>
+      <w:r>
+        <w:rPr>
+          <w:i/>
+          <w:iCs/>
+          <w:sz w:val="20"/>
+          <w:szCs w:val="20"/>
+        </w:rPr>
+        <w:t xml:space="preserve">De finibus</w:t>
+      </w:r>
+      <w:r>
+        <w:rPr>
+          <w:sz w:val="20"/>
+          <w:szCs w:val="20"/>
+        </w:rPr>
+        <w:t xml:space="preserve"> 1–2. </w:t>
+      </w:r>
+      <w:r>
+        <w:rPr>
+          <w:i/>
+          <w:iCs/>
+          <w:sz w:val="20"/>
+          <w:szCs w:val="20"/>
+        </w:rPr>
+        <w:t xml:space="preserve">The Classical Quarterly, 74</w:t>
+      </w:r>
+      <w:r>
+        <w:rPr>
+          <w:sz w:val="20"/>
+          <w:szCs w:val="20"/>
+        </w:rPr>
+        <w:t xml:space="preserve">(1), 124–134. https://doi.org/10.1017/S0009838824000107</w:t>
       </w:r>
     </w:p>
     <w:p>

</xml_diff>

<commit_message>
Add four figures (methods, corruption, timeline, interdisciplinary map)
Vector figures generated with cairosvg (make_figures.py); embedded in the
.docx with APA-style centered captions and referenced in-text. Editable
SVG and high-res PNG sources committed under figures/.

- Fig 1: narrative-review + adversarial-verification workflow (Methods)
- Fig 2: corruption pathway, Cicero -> 1914 page break -> placeholder
- Fig 3: transmission timeline, with the '1500s' conjecture flagged
- Fig 4: interdisciplinary map of the three lenses

https://claude.ai/code/session_011EEXvpWJaEGXMadBDpkP79
</commit_message>
<xml_diff>
--- a/lorem-ipsum-narrative-review.docx
+++ b/lorem-ipsum-narrative-review.docx
@@ -535,7 +535,77 @@
         <w:t xml:space="preserve"> directly.</w:t>
       </w:r>
       <w:r>
-        <w:t xml:space="preserve">* The placeholder's history lives in classicist commentary, design-trade history, and journalism; its functional effects must be inferred from adjacent experimental literature. The review's contribution is therefore integrative and critical rather than empirical.</w:t>
+        <w:t xml:space="preserve">* The placeholder's history lives in classicist commentary, design-trade history, and journalism; its functional effects must be inferred from adjacent experimental literature. The review's contribution is therefore integrative and critical rather than empirical. The overall procedure and the source-quality tiers applied during synthesis are summarized in Figure 1.</w:t>
+      </w:r>
+    </w:p>
+    <w:p>
+      <w:pPr>
+        <w:spacing w:after="40" w:before="120" w:line="240" w:lineRule="auto"/>
+        <w:jc w:val="center"/>
+      </w:pPr>
+      <w:r>
+        <w:drawing>
+          <wp:inline distT="0" distB="0" distL="0" distR="0">
+            <wp:extent cx="5715000" cy="1981200"/>
+            <wp:effectExtent t="0" r="0" b="0" l="0"/>
+            <wp:docPr id="1" name="Figure 1. The structured narrative-review and adversarial-verification workflow, with the source-quality tiers applied during synthesis." descr="Figure 1. The structured narrative-review and adversarial-verification workflow, with the source-quality tiers applied during synthesis." title="Figure 1. The structured narrative-review and adversarial-verification workflow, with the source-quality tiers applied during synthesis."/>
+            <wp:cNvGraphicFramePr>
+              <a:graphicFrameLocks xmlns:a="http://schemas.openxmlformats.org/drawingml/2006/main" noChangeAspect="1"/>
+            </wp:cNvGraphicFramePr>
+            <a:graphic xmlns:a="http://schemas.openxmlformats.org/drawingml/2006/main">
+              <a:graphicData uri="http://schemas.openxmlformats.org/drawingml/2006/picture">
+                <pic:pic xmlns:pic="http://schemas.openxmlformats.org/drawingml/2006/picture">
+                  <pic:nvPicPr>
+                    <pic:cNvPr id="0" name="" descr=""/>
+                    <pic:cNvPicPr>
+                      <a:picLocks noChangeAspect="1" noChangeArrowheads="1"/>
+                    </pic:cNvPicPr>
+                  </pic:nvPicPr>
+                  <pic:blipFill>
+                    <a:blip r:embed="rId7" cstate="none"/>
+                    <a:srcRect/>
+                    <a:stretch>
+                      <a:fillRect/>
+                    </a:stretch>
+                  </pic:blipFill>
+                  <pic:spPr bwMode="auto">
+                    <a:xfrm>
+                      <a:off x="0" y="0"/>
+                      <a:ext cx="5715000" cy="1981200"/>
+                    </a:xfrm>
+                    <a:prstGeom prst="rect">
+                      <a:avLst/>
+                    </a:prstGeom>
+                  </pic:spPr>
+                </pic:pic>
+              </a:graphicData>
+            </a:graphic>
+          </wp:inline>
+        </w:drawing>
+      </w:r>
+    </w:p>
+    <w:p>
+      <w:pPr>
+        <w:spacing w:after="200" w:before="0" w:line="240" w:lineRule="auto"/>
+        <w:jc w:val="center"/>
+      </w:pPr>
+      <w:r>
+        <w:rPr>
+          <w:b/>
+          <w:bCs/>
+          <w:sz w:val="18"/>
+          <w:szCs w:val="18"/>
+        </w:rPr>
+        <w:t xml:space="preserve">Figure 1. </w:t>
+      </w:r>
+      <w:r>
+        <w:rPr>
+          <w:i/>
+          <w:iCs/>
+          <w:sz w:val="18"/>
+          <w:szCs w:val="18"/>
+        </w:rPr>
+        <w:t xml:space="preserve">The structured narrative-review and adversarial-verification workflow, with the source-quality tiers applied during synthesis.</w:t>
       </w:r>
     </w:p>
     <w:p>
@@ -1200,6 +1270,76 @@
     </w:p>
     <w:p>
       <w:pPr>
+        <w:spacing w:after="40" w:before="120" w:line="240" w:lineRule="auto"/>
+        <w:jc w:val="center"/>
+      </w:pPr>
+      <w:r>
+        <w:drawing>
+          <wp:inline distT="0" distB="0" distL="0" distR="0">
+            <wp:extent cx="5715000" cy="2571750"/>
+            <wp:effectExtent t="0" r="0" b="0" l="0"/>
+            <wp:docPr id="1" name="Figure 2. The corruption pathway from Cicero's original Latin (A), through the 1914 Loeb page break that severs &quot;do-&quot; from &quot;lorem&quot; (B), to the standard placeholder with its non-existent forms (C)." descr="Figure 2. The corruption pathway from Cicero's original Latin (A), through the 1914 Loeb page break that severs &quot;do-&quot; from &quot;lorem&quot; (B), to the standard placeholder with its non-existent forms (C)." title="Figure 2. The corruption pathway from Cicero's original Latin (A), through the 1914 Loeb page break that severs &quot;do-&quot; from &quot;lorem&quot; (B), to the standard placeholder with its non-existent forms (C)."/>
+            <wp:cNvGraphicFramePr>
+              <a:graphicFrameLocks xmlns:a="http://schemas.openxmlformats.org/drawingml/2006/main" noChangeAspect="1"/>
+            </wp:cNvGraphicFramePr>
+            <a:graphic xmlns:a="http://schemas.openxmlformats.org/drawingml/2006/main">
+              <a:graphicData uri="http://schemas.openxmlformats.org/drawingml/2006/picture">
+                <pic:pic xmlns:pic="http://schemas.openxmlformats.org/drawingml/2006/picture">
+                  <pic:nvPicPr>
+                    <pic:cNvPr id="0" name="" descr=""/>
+                    <pic:cNvPicPr>
+                      <a:picLocks noChangeAspect="1" noChangeArrowheads="1"/>
+                    </pic:cNvPicPr>
+                  </pic:nvPicPr>
+                  <pic:blipFill>
+                    <a:blip r:embed="rId8" cstate="none"/>
+                    <a:srcRect/>
+                    <a:stretch>
+                      <a:fillRect/>
+                    </a:stretch>
+                  </pic:blipFill>
+                  <pic:spPr bwMode="auto">
+                    <a:xfrm>
+                      <a:off x="0" y="0"/>
+                      <a:ext cx="5715000" cy="2571750"/>
+                    </a:xfrm>
+                    <a:prstGeom prst="rect">
+                      <a:avLst/>
+                    </a:prstGeom>
+                  </pic:spPr>
+                </pic:pic>
+              </a:graphicData>
+            </a:graphic>
+          </wp:inline>
+        </w:drawing>
+      </w:r>
+    </w:p>
+    <w:p>
+      <w:pPr>
+        <w:spacing w:after="200" w:before="0" w:line="240" w:lineRule="auto"/>
+        <w:jc w:val="center"/>
+      </w:pPr>
+      <w:r>
+        <w:rPr>
+          <w:b/>
+          <w:bCs/>
+          <w:sz w:val="18"/>
+          <w:szCs w:val="18"/>
+        </w:rPr>
+        <w:t xml:space="preserve">Figure 2. </w:t>
+      </w:r>
+      <w:r>
+        <w:rPr>
+          <w:i/>
+          <w:iCs/>
+          <w:sz w:val="18"/>
+          <w:szCs w:val="18"/>
+        </w:rPr>
+        <w:t xml:space="preserve">The corruption pathway from Cicero's original Latin (A), through the 1914 Loeb page break that severs "do-" from "lorem" (B), to the standard placeholder with its non-existent forms (C).</w:t>
+      </w:r>
+    </w:p>
+    <w:p>
+      <w:pPr>
         <w:spacing w:after="120" w:line="240" w:lineRule="auto"/>
         <w:jc w:val="both"/>
       </w:pPr>
@@ -1640,7 +1780,77 @@
         <w:t xml:space="preserve">lorem ipsum</w:t>
       </w:r>
       <w:r>
-        <w:t xml:space="preserve"> had become an infrastructural default—generated on demand by countless tools and shipped inside design software—such that its presence in a layout signals "content pending" to practitioners worldwide.</w:t>
+        <w:t xml:space="preserve"> had become an infrastructural default—generated on demand by countless tools and shipped inside design software—such that its presence in a layout signals "content pending" to practitioners worldwide. Figure 3 sets out this chronology, distinguishing the documented milestones from the rejected "1500s" conjecture.</w:t>
+      </w:r>
+    </w:p>
+    <w:p>
+      <w:pPr>
+        <w:spacing w:after="40" w:before="120" w:line="240" w:lineRule="auto"/>
+        <w:jc w:val="center"/>
+      </w:pPr>
+      <w:r>
+        <w:drawing>
+          <wp:inline distT="0" distB="0" distL="0" distR="0">
+            <wp:extent cx="5715000" cy="2238375"/>
+            <wp:effectExtent t="0" r="0" b="0" l="0"/>
+            <wp:docPr id="1" name="Figure 3. Transmission of lorem ipsum from Cicero (45 BCE) to the contemporary web. The &quot;in use since the 1500s&quot; claim is shown as a rejected conjecture; the earliest attested use is the 1966 Letraset sheets. Not to scale." descr="Figure 3. Transmission of lorem ipsum from Cicero (45 BCE) to the contemporary web. The &quot;in use since the 1500s&quot; claim is shown as a rejected conjecture; the earliest attested use is the 1966 Letraset sheets. Not to scale." title="Figure 3. Transmission of lorem ipsum from Cicero (45 BCE) to the contemporary web. The &quot;in use since the 1500s&quot; claim is shown as a rejected conjecture; the earliest attested use is the 1966 Letraset sheets. Not to scale."/>
+            <wp:cNvGraphicFramePr>
+              <a:graphicFrameLocks xmlns:a="http://schemas.openxmlformats.org/drawingml/2006/main" noChangeAspect="1"/>
+            </wp:cNvGraphicFramePr>
+            <a:graphic xmlns:a="http://schemas.openxmlformats.org/drawingml/2006/main">
+              <a:graphicData uri="http://schemas.openxmlformats.org/drawingml/2006/picture">
+                <pic:pic xmlns:pic="http://schemas.openxmlformats.org/drawingml/2006/picture">
+                  <pic:nvPicPr>
+                    <pic:cNvPr id="0" name="" descr=""/>
+                    <pic:cNvPicPr>
+                      <a:picLocks noChangeAspect="1" noChangeArrowheads="1"/>
+                    </pic:cNvPicPr>
+                  </pic:nvPicPr>
+                  <pic:blipFill>
+                    <a:blip r:embed="rId9" cstate="none"/>
+                    <a:srcRect/>
+                    <a:stretch>
+                      <a:fillRect/>
+                    </a:stretch>
+                  </pic:blipFill>
+                  <pic:spPr bwMode="auto">
+                    <a:xfrm>
+                      <a:off x="0" y="0"/>
+                      <a:ext cx="5715000" cy="2238375"/>
+                    </a:xfrm>
+                    <a:prstGeom prst="rect">
+                      <a:avLst/>
+                    </a:prstGeom>
+                  </pic:spPr>
+                </pic:pic>
+              </a:graphicData>
+            </a:graphic>
+          </wp:inline>
+        </w:drawing>
+      </w:r>
+    </w:p>
+    <w:p>
+      <w:pPr>
+        <w:spacing w:after="200" w:before="0" w:line="240" w:lineRule="auto"/>
+        <w:jc w:val="center"/>
+      </w:pPr>
+      <w:r>
+        <w:rPr>
+          <w:b/>
+          <w:bCs/>
+          <w:sz w:val="18"/>
+          <w:szCs w:val="18"/>
+        </w:rPr>
+        <w:t xml:space="preserve">Figure 3. </w:t>
+      </w:r>
+      <w:r>
+        <w:rPr>
+          <w:i/>
+          <w:iCs/>
+          <w:sz w:val="18"/>
+          <w:szCs w:val="18"/>
+        </w:rPr>
+        <w:t xml:space="preserve">Transmission of lorem ipsum from Cicero (45 BCE) to the contemporary web. The "in use since the 1500s" claim is shown as a rejected conjecture; the earliest attested use is the 1966 Letraset sheets. Not to scale.</w:t>
       </w:r>
     </w:p>
     <w:p>
@@ -2011,7 +2221,77 @@
         <w:jc w:val="both"/>
       </w:pPr>
       <w:r>
-        <w:t xml:space="preserve">Three themes emerge from this synthesis.</w:t>
+        <w:t xml:space="preserve">Three themes emerge from this synthesis, which the interdisciplinary synthesis in Figure 4 draws together.</w:t>
+      </w:r>
+    </w:p>
+    <w:p>
+      <w:pPr>
+        <w:spacing w:after="40" w:before="120" w:line="240" w:lineRule="auto"/>
+        <w:jc w:val="center"/>
+      </w:pPr>
+      <w:r>
+        <w:drawing>
+          <wp:inline distT="0" distB="0" distL="0" distR="0">
+            <wp:extent cx="5715000" cy="3333750"/>
+            <wp:effectExtent t="0" r="0" b="0" l="0"/>
+            <wp:docPr id="1" name="Figure 4. Lorem ipsum at the intersection of three scholarly lenses—classical reception, design history, and HCI/UX—converging on the reading of the text as an accidental case of classical reception." descr="Figure 4. Lorem ipsum at the intersection of three scholarly lenses—classical reception, design history, and HCI/UX—converging on the reading of the text as an accidental case of classical reception." title="Figure 4. Lorem ipsum at the intersection of three scholarly lenses—classical reception, design history, and HCI/UX—converging on the reading of the text as an accidental case of classical reception."/>
+            <wp:cNvGraphicFramePr>
+              <a:graphicFrameLocks xmlns:a="http://schemas.openxmlformats.org/drawingml/2006/main" noChangeAspect="1"/>
+            </wp:cNvGraphicFramePr>
+            <a:graphic xmlns:a="http://schemas.openxmlformats.org/drawingml/2006/main">
+              <a:graphicData uri="http://schemas.openxmlformats.org/drawingml/2006/picture">
+                <pic:pic xmlns:pic="http://schemas.openxmlformats.org/drawingml/2006/picture">
+                  <pic:nvPicPr>
+                    <pic:cNvPr id="0" name="" descr=""/>
+                    <pic:cNvPicPr>
+                      <a:picLocks noChangeAspect="1" noChangeArrowheads="1"/>
+                    </pic:cNvPicPr>
+                  </pic:nvPicPr>
+                  <pic:blipFill>
+                    <a:blip r:embed="rId10" cstate="none"/>
+                    <a:srcRect/>
+                    <a:stretch>
+                      <a:fillRect/>
+                    </a:stretch>
+                  </pic:blipFill>
+                  <pic:spPr bwMode="auto">
+                    <a:xfrm>
+                      <a:off x="0" y="0"/>
+                      <a:ext cx="5715000" cy="3333750"/>
+                    </a:xfrm>
+                    <a:prstGeom prst="rect">
+                      <a:avLst/>
+                    </a:prstGeom>
+                  </pic:spPr>
+                </pic:pic>
+              </a:graphicData>
+            </a:graphic>
+          </wp:inline>
+        </w:drawing>
+      </w:r>
+    </w:p>
+    <w:p>
+      <w:pPr>
+        <w:spacing w:after="200" w:before="0" w:line="240" w:lineRule="auto"/>
+        <w:jc w:val="center"/>
+      </w:pPr>
+      <w:r>
+        <w:rPr>
+          <w:b/>
+          <w:bCs/>
+          <w:sz w:val="18"/>
+          <w:szCs w:val="18"/>
+        </w:rPr>
+        <w:t xml:space="preserve">Figure 4. </w:t>
+      </w:r>
+      <w:r>
+        <w:rPr>
+          <w:i/>
+          <w:iCs/>
+          <w:sz w:val="18"/>
+          <w:szCs w:val="18"/>
+        </w:rPr>
+        <w:t xml:space="preserve">Lorem ipsum at the intersection of three scholarly lenses—classical reception, design history, and HCI/UX—converging on the reading of the text as an accidental case of classical reception.</w:t>
       </w:r>
     </w:p>
     <w:p>

</xml_diff>